<commit_message>
Align agreement plan prices with website
Co-authored-by: Copilot <223556219+Copilot@users.noreply.github.com>
</commit_message>
<xml_diff>
--- a/Lumeo-Advisory-Client-Engagement-Agreement.docx
+++ b/Lumeo-Advisory-Client-Engagement-Agreement.docx
@@ -663,7 +663,7 @@
                 <w:color w:val="4E8493"/>
                 <w:sz w:val="20"/>
               </w:rPr>
-              <w:t>R2,500 per month, excluding VAT</w:t>
+              <w:t>R2,000 per month, excluding VAT</w:t>
             </w:r>
             <w:r>
               <w:rPr>
@@ -796,7 +796,7 @@
                 <w:color w:val="4E8493"/>
                 <w:sz w:val="20"/>
               </w:rPr>
-              <w:t>R5,800 per month, excluding VAT</w:t>
+              <w:t>R3,800 per month, excluding VAT</w:t>
             </w:r>
             <w:r>
               <w:rPr>

</xml_diff>

<commit_message>
Make agreement digitally fillable and add PDF
Co-authored-by: Copilot <223556219+Copilot@users.noreply.github.com>
</commit_message>
<xml_diff>
--- a/Lumeo-Advisory-Client-Engagement-Agreement.docx
+++ b/Lumeo-Advisory-Client-Engagement-Agreement.docx
@@ -36,13 +36,14 @@
     <w:tbl>
       <w:tblPr>
         <w:tblW w:type="auto" w:w="0"/>
-        <w:jc w:val="center"/>
         <w:tblLayout w:type="fixed"/>
         <w:tblLook w:firstColumn="1" w:firstRow="1" w:lastColumn="0" w:lastRow="0" w:noHBand="0" w:noVBand="1" w:val="04A0"/>
+        <w:jc w:val="left"/>
+        <w:tblInd w:w="0" w:type="dxa"/>
       </w:tblPr>
       <w:tblGrid>
-        <w:gridCol w:w="2592"/>
-        <w:gridCol w:w="7560"/>
+        <w:gridCol w:w="2448"/>
+        <w:gridCol w:w="7099"/>
       </w:tblGrid>
       <w:tr>
         <w:trPr>
@@ -50,7 +51,7 @@
         </w:trPr>
         <w:tc>
           <w:tcPr>
-            <w:tcW w:type="dxa" w:w="2592"/>
+            <w:tcW w:type="dxa" w:w="2448"/>
             <w:vAlign w:val="center"/>
             <w:tcMar>
               <w:top w:w="100" w:type="dxa"/>
@@ -81,7 +82,7 @@
         </w:tc>
         <w:tc>
           <w:tcPr>
-            <w:tcW w:type="dxa" w:w="7560"/>
+            <w:tcW w:type="dxa" w:w="7099"/>
             <w:vAlign w:val="center"/>
             <w:tcMar>
               <w:top w:w="100" w:type="dxa"/>
@@ -116,7 +117,7 @@
         </w:trPr>
         <w:tc>
           <w:tcPr>
-            <w:tcW w:type="dxa" w:w="2592"/>
+            <w:tcW w:type="dxa" w:w="2448"/>
             <w:vAlign w:val="center"/>
             <w:tcMar>
               <w:top w:w="100" w:type="dxa"/>
@@ -147,7 +148,7 @@
         </w:tc>
         <w:tc>
           <w:tcPr>
-            <w:tcW w:type="dxa" w:w="7560"/>
+            <w:tcW w:type="dxa" w:w="7099"/>
             <w:vAlign w:val="center"/>
             <w:tcMar>
               <w:top w:w="100" w:type="dxa"/>
@@ -163,16 +164,22 @@
             <w:pPr>
               <w:spacing w:after="0"/>
             </w:pPr>
-            <w:r/>
-            <w:r>
-              <w:rPr>
-                <w:rFonts w:ascii="Aptos" w:hAnsi="Aptos"/>
-                <w:b w:val="0"/>
-                <w:color w:val="263640"/>
-                <w:sz w:val="18"/>
-              </w:rPr>
-              <w:t>[Client business name / individual name]</w:t>
-            </w:r>
+            <w:sdt>
+              <w:sdtPr>
+                <w:alias w:val="Entry"/>
+                <w:tag w:val="lumeo.entry"/>
+                <w:text/>
+              </w:sdtPr>
+              <w:sdtContent>
+                <w:r>
+                  <w:rPr>
+                    <w:color w:val="6E7E88"/>
+                    <w:i/>
+                  </w:rPr>
+                  <w:t xml:space="preserve">[Click or tap to enter client name]</w:t>
+                </w:r>
+              </w:sdtContent>
+            </w:sdt>
           </w:p>
         </w:tc>
       </w:tr>
@@ -182,7 +189,7 @@
         </w:trPr>
         <w:tc>
           <w:tcPr>
-            <w:tcW w:type="dxa" w:w="2592"/>
+            <w:tcW w:type="dxa" w:w="2448"/>
             <w:vAlign w:val="center"/>
             <w:tcMar>
               <w:top w:w="100" w:type="dxa"/>
@@ -213,7 +220,7 @@
         </w:tc>
         <w:tc>
           <w:tcPr>
-            <w:tcW w:type="dxa" w:w="7560"/>
+            <w:tcW w:type="dxa" w:w="7099"/>
             <w:vAlign w:val="center"/>
             <w:tcMar>
               <w:top w:w="100" w:type="dxa"/>
@@ -229,16 +236,22 @@
             <w:pPr>
               <w:spacing w:after="0"/>
             </w:pPr>
-            <w:r/>
-            <w:r>
-              <w:rPr>
-                <w:rFonts w:ascii="Aptos" w:hAnsi="Aptos"/>
-                <w:b w:val="0"/>
-                <w:color w:val="263640"/>
-                <w:sz w:val="18"/>
-              </w:rPr>
-              <w:t>[Company registration number / ID number, if applicable]</w:t>
-            </w:r>
+            <w:sdt>
+              <w:sdtPr>
+                <w:alias w:val="Entry"/>
+                <w:tag w:val="lumeo.entry"/>
+                <w:text/>
+              </w:sdtPr>
+              <w:sdtContent>
+                <w:r>
+                  <w:rPr>
+                    <w:color w:val="6E7E88"/>
+                    <w:i/>
+                  </w:rPr>
+                  <w:t xml:space="preserve">[Click or tap to enter company number or ID]</w:t>
+                </w:r>
+              </w:sdtContent>
+            </w:sdt>
           </w:p>
         </w:tc>
       </w:tr>
@@ -248,7 +261,7 @@
         </w:trPr>
         <w:tc>
           <w:tcPr>
-            <w:tcW w:type="dxa" w:w="2592"/>
+            <w:tcW w:type="dxa" w:w="2448"/>
             <w:vAlign w:val="center"/>
             <w:tcMar>
               <w:top w:w="100" w:type="dxa"/>
@@ -279,7 +292,7 @@
         </w:tc>
         <w:tc>
           <w:tcPr>
-            <w:tcW w:type="dxa" w:w="7560"/>
+            <w:tcW w:type="dxa" w:w="7099"/>
             <w:vAlign w:val="center"/>
             <w:tcMar>
               <w:top w:w="100" w:type="dxa"/>
@@ -295,16 +308,22 @@
             <w:pPr>
               <w:spacing w:after="0"/>
             </w:pPr>
-            <w:r/>
-            <w:r>
-              <w:rPr>
-                <w:rFonts w:ascii="Aptos" w:hAnsi="Aptos"/>
-                <w:b w:val="0"/>
-                <w:color w:val="263640"/>
-                <w:sz w:val="18"/>
-              </w:rPr>
-              <w:t>[Physical or registered address]</w:t>
-            </w:r>
+            <w:sdt>
+              <w:sdtPr>
+                <w:alias w:val="Entry"/>
+                <w:tag w:val="lumeo.entry"/>
+                <w:text/>
+              </w:sdtPr>
+              <w:sdtContent>
+                <w:r>
+                  <w:rPr>
+                    <w:color w:val="6E7E88"/>
+                    <w:i/>
+                  </w:rPr>
+                  <w:t xml:space="preserve">[Click or tap to enter client address]</w:t>
+                </w:r>
+              </w:sdtContent>
+            </w:sdt>
           </w:p>
         </w:tc>
       </w:tr>
@@ -314,7 +333,7 @@
         </w:trPr>
         <w:tc>
           <w:tcPr>
-            <w:tcW w:type="dxa" w:w="2592"/>
+            <w:tcW w:type="dxa" w:w="2448"/>
             <w:vAlign w:val="center"/>
             <w:tcMar>
               <w:top w:w="100" w:type="dxa"/>
@@ -345,7 +364,7 @@
         </w:tc>
         <w:tc>
           <w:tcPr>
-            <w:tcW w:type="dxa" w:w="7560"/>
+            <w:tcW w:type="dxa" w:w="7099"/>
             <w:vAlign w:val="center"/>
             <w:tcMar>
               <w:top w:w="100" w:type="dxa"/>
@@ -361,16 +380,22 @@
             <w:pPr>
               <w:spacing w:after="0"/>
             </w:pPr>
-            <w:r/>
-            <w:r>
-              <w:rPr>
-                <w:rFonts w:ascii="Aptos" w:hAnsi="Aptos"/>
-                <w:b w:val="0"/>
-                <w:color w:val="263640"/>
-                <w:sz w:val="18"/>
-              </w:rPr>
-              <w:t>[DD / MM / YYYY]</w:t>
-            </w:r>
+            <w:sdt>
+              <w:sdtPr>
+                <w:alias w:val="Entry"/>
+                <w:tag w:val="lumeo.entry"/>
+                <w:text/>
+              </w:sdtPr>
+              <w:sdtContent>
+                <w:r>
+                  <w:rPr>
+                    <w:color w:val="6E7E88"/>
+                    <w:i/>
+                  </w:rPr>
+                  <w:t xml:space="preserve">[Click or tap to enter agreement date]</w:t>
+                </w:r>
+              </w:sdtContent>
+            </w:sdt>
           </w:p>
         </w:tc>
       </w:tr>
@@ -380,7 +405,7 @@
         </w:trPr>
         <w:tc>
           <w:tcPr>
-            <w:tcW w:type="dxa" w:w="2592"/>
+            <w:tcW w:type="dxa" w:w="2448"/>
             <w:vAlign w:val="center"/>
             <w:tcMar>
               <w:top w:w="100" w:type="dxa"/>
@@ -411,7 +436,7 @@
         </w:tc>
         <w:tc>
           <w:tcPr>
-            <w:tcW w:type="dxa" w:w="7560"/>
+            <w:tcW w:type="dxa" w:w="7099"/>
             <w:vAlign w:val="center"/>
             <w:tcMar>
               <w:top w:w="100" w:type="dxa"/>
@@ -427,15 +452,86 @@
             <w:pPr>
               <w:spacing w:after="0"/>
             </w:pPr>
-            <w:r/>
+            <w:sdt>
+              <w:sdtPr>
+                <w:alias w:val="Starter All-In-One"/>
+                <w:tag w:val="lumeo.plan.starter-all-in-one"/>
+                <w14:checkbox>
+                  <w14:checked w14:val="0"/>
+                  <w14:checkedState w14:val="2612" w14:font="MS Gothic"/>
+                  <w14:uncheckedState w14:val="2610" w14:font="MS Gothic"/>
+                </w14:checkbox>
+              </w:sdtPr>
+              <w:sdtContent>
+                <w:r>
+                  <w:rPr>
+                    <w:rFonts w:ascii="MS Gothic" w:hAnsi="MS Gothic"/>
+                  </w:rPr>
+                  <w:t>☐</w:t>
+                </w:r>
+              </w:sdtContent>
+            </w:sdt>
             <w:r>
               <w:rPr>
-                <w:rFonts w:ascii="Aptos" w:hAnsi="Aptos"/>
-                <w:b w:val="0"/>
-                <w:color w:val="263640"/>
-                <w:sz w:val="18"/>
+                <w:sz w:val="16"/>
               </w:rPr>
-              <w:t>☐ Starter All-In-One     ☐ Growth All-In-One     ☐ Executive / Custom Scheme</w:t>
+              <w:t xml:space="preserve"> Starter All-In-One</w:t>
+            </w:r>
+            <w:r>
+              <w:t xml:space="preserve">    </w:t>
+            </w:r>
+            <w:sdt>
+              <w:sdtPr>
+                <w:alias w:val="Growth All-In-One"/>
+                <w:tag w:val="lumeo.plan.growth-all-in-one"/>
+                <w14:checkbox>
+                  <w14:checked w14:val="0"/>
+                  <w14:checkedState w14:val="2612" w14:font="MS Gothic"/>
+                  <w14:uncheckedState w14:val="2610" w14:font="MS Gothic"/>
+                </w14:checkbox>
+              </w:sdtPr>
+              <w:sdtContent>
+                <w:r>
+                  <w:rPr>
+                    <w:rFonts w:ascii="MS Gothic" w:hAnsi="MS Gothic"/>
+                  </w:rPr>
+                  <w:t>☐</w:t>
+                </w:r>
+              </w:sdtContent>
+            </w:sdt>
+            <w:r>
+              <w:rPr>
+                <w:sz w:val="16"/>
+              </w:rPr>
+              <w:t xml:space="preserve"> Growth All-In-One</w:t>
+            </w:r>
+            <w:r>
+              <w:t xml:space="preserve">    </w:t>
+            </w:r>
+            <w:sdt>
+              <w:sdtPr>
+                <w:alias w:val="Executive / Custom Scheme"/>
+                <w:tag w:val="lumeo.plan.executive-/-custom-scheme"/>
+                <w14:checkbox>
+                  <w14:checked w14:val="0"/>
+                  <w14:checkedState w14:val="2612" w14:font="MS Gothic"/>
+                  <w14:uncheckedState w14:val="2610" w14:font="MS Gothic"/>
+                </w14:checkbox>
+              </w:sdtPr>
+              <w:sdtContent>
+                <w:r>
+                  <w:rPr>
+                    <w:rFonts w:ascii="MS Gothic" w:hAnsi="MS Gothic"/>
+                  </w:rPr>
+                  <w:t>☐</w:t>
+                </w:r>
+              </w:sdtContent>
+            </w:sdt>
+            <w:r>
+              <w:rPr>
+                <w:sz w:val="16"/>
+              </w:rPr>
+              <w:t xml:space="preserve"> Executive / Custom Scheme</w:t>
             </w:r>
           </w:p>
         </w:tc>
@@ -446,7 +542,7 @@
         </w:trPr>
         <w:tc>
           <w:tcPr>
-            <w:tcW w:type="dxa" w:w="2592"/>
+            <w:tcW w:type="dxa" w:w="2448"/>
             <w:vAlign w:val="center"/>
             <w:tcMar>
               <w:top w:w="100" w:type="dxa"/>
@@ -477,7 +573,7 @@
         </w:tc>
         <w:tc>
           <w:tcPr>
-            <w:tcW w:type="dxa" w:w="7560"/>
+            <w:tcW w:type="dxa" w:w="7099"/>
             <w:vAlign w:val="center"/>
             <w:tcMar>
               <w:top w:w="100" w:type="dxa"/>
@@ -493,16 +589,44 @@
             <w:pPr>
               <w:spacing w:after="0"/>
             </w:pPr>
-            <w:r/>
             <w:r>
-              <w:rPr>
-                <w:rFonts w:ascii="Aptos" w:hAnsi="Aptos"/>
-                <w:b w:val="0"/>
-                <w:color w:val="263640"/>
-                <w:sz w:val="18"/>
-              </w:rPr>
-              <w:t>R[                 ] excluding VAT  |  Custom scope, if applicable: [                         ]</w:t>
+              <w:t>R</w:t>
             </w:r>
+            <w:sdt>
+              <w:sdtPr>
+                <w:alias w:val="Monthly fee"/>
+                <w:tag w:val="lumeo.monthly-fee"/>
+                <w:text/>
+              </w:sdtPr>
+              <w:sdtContent>
+                <w:r>
+                  <w:rPr>
+                    <w:color w:val="6E7E88"/>
+                    <w:i/>
+                  </w:rPr>
+                  <w:t xml:space="preserve">[monthly amount]</w:t>
+                </w:r>
+              </w:sdtContent>
+            </w:sdt>
+            <w:r>
+              <w:t xml:space="preserve"> excluding VAT  |  Custom scope: </w:t>
+            </w:r>
+            <w:sdt>
+              <w:sdtPr>
+                <w:alias w:val="Custom scope"/>
+                <w:tag w:val="lumeo.custom-scope"/>
+                <w:text/>
+              </w:sdtPr>
+              <w:sdtContent>
+                <w:r>
+                  <w:rPr>
+                    <w:color w:val="6E7E88"/>
+                    <w:i/>
+                  </w:rPr>
+                  <w:t xml:space="preserve">[click to enter agreed scope]</w:t>
+                </w:r>
+              </w:sdtContent>
+            </w:sdt>
           </w:p>
         </w:tc>
       </w:tr>
@@ -512,7 +636,7 @@
         </w:trPr>
         <w:tc>
           <w:tcPr>
-            <w:tcW w:type="dxa" w:w="2592"/>
+            <w:tcW w:type="dxa" w:w="2448"/>
             <w:vAlign w:val="center"/>
             <w:tcMar>
               <w:top w:w="100" w:type="dxa"/>
@@ -543,7 +667,7 @@
         </w:tc>
         <w:tc>
           <w:tcPr>
-            <w:tcW w:type="dxa" w:w="7560"/>
+            <w:tcW w:type="dxa" w:w="7099"/>
             <w:vAlign w:val="center"/>
             <w:tcMar>
               <w:top w:w="100" w:type="dxa"/>
@@ -559,20 +683,133 @@
             <w:pPr>
               <w:spacing w:after="0"/>
             </w:pPr>
-            <w:r/>
+            <w:sdt>
+              <w:sdtPr>
+                <w:alias w:val="Website Starter"/>
+                <w:tag w:val="lumeo.plan.website-starter"/>
+                <w14:checkbox>
+                  <w14:checked w14:val="0"/>
+                  <w14:checkedState w14:val="2612" w14:font="MS Gothic"/>
+                  <w14:uncheckedState w14:val="2610" w14:font="MS Gothic"/>
+                </w14:checkbox>
+              </w:sdtPr>
+              <w:sdtContent>
+                <w:r>
+                  <w:rPr>
+                    <w:rFonts w:ascii="MS Gothic" w:hAnsi="MS Gothic"/>
+                  </w:rPr>
+                  <w:t>☐</w:t>
+                </w:r>
+              </w:sdtContent>
+            </w:sdt>
             <w:r>
               <w:rPr>
-                <w:rFonts w:ascii="Aptos" w:hAnsi="Aptos"/>
-                <w:b w:val="0"/>
-                <w:color w:val="263640"/>
-                <w:sz w:val="18"/>
+                <w:sz w:val="16"/>
               </w:rPr>
-              <w:t>☐ Starter: R1,500   ☐ Growth: R4,500   ☐ Executive: custom quote   ☐ Not selected</w:t>
+              <w:t xml:space="preserve"> Starter: R1,500</w:t>
+            </w:r>
+            <w:r>
+              <w:t xml:space="preserve">   </w:t>
+            </w:r>
+            <w:sdt>
+              <w:sdtPr>
+                <w:alias w:val="Website Growth"/>
+                <w:tag w:val="lumeo.plan.website-growth"/>
+                <w14:checkbox>
+                  <w14:checked w14:val="0"/>
+                  <w14:checkedState w14:val="2612" w14:font="MS Gothic"/>
+                  <w14:uncheckedState w14:val="2610" w14:font="MS Gothic"/>
+                </w14:checkbox>
+              </w:sdtPr>
+              <w:sdtContent>
+                <w:r>
+                  <w:rPr>
+                    <w:rFonts w:ascii="MS Gothic" w:hAnsi="MS Gothic"/>
+                  </w:rPr>
+                  <w:t>☐</w:t>
+                </w:r>
+              </w:sdtContent>
+            </w:sdt>
+            <w:r>
+              <w:rPr>
+                <w:sz w:val="16"/>
+              </w:rPr>
+              <w:t xml:space="preserve"> Growth: R4,500</w:t>
+            </w:r>
+            <w:r>
+              <w:t xml:space="preserve">   </w:t>
+            </w:r>
+            <w:sdt>
+              <w:sdtPr>
+                <w:alias w:val="Website Executive"/>
+                <w:tag w:val="lumeo.plan.website-executive"/>
+                <w14:checkbox>
+                  <w14:checked w14:val="0"/>
+                  <w14:checkedState w14:val="2612" w14:font="MS Gothic"/>
+                  <w14:uncheckedState w14:val="2610" w14:font="MS Gothic"/>
+                </w14:checkbox>
+              </w:sdtPr>
+              <w:sdtContent>
+                <w:r>
+                  <w:rPr>
+                    <w:rFonts w:ascii="MS Gothic" w:hAnsi="MS Gothic"/>
+                  </w:rPr>
+                  <w:t>☐</w:t>
+                </w:r>
+              </w:sdtContent>
+            </w:sdt>
+            <w:r>
+              <w:rPr>
+                <w:sz w:val="16"/>
+              </w:rPr>
+              <w:t xml:space="preserve"> Executive: custom quote</w:t>
+            </w:r>
+            <w:r>
+              <w:t xml:space="preserve">   </w:t>
+            </w:r>
+            <w:sdt>
+              <w:sdtPr>
+                <w:alias w:val="Website Not selected"/>
+                <w:tag w:val="lumeo.plan.website-not-selected"/>
+                <w14:checkbox>
+                  <w14:checked w14:val="0"/>
+                  <w14:checkedState w14:val="2612" w14:font="MS Gothic"/>
+                  <w14:uncheckedState w14:val="2610" w14:font="MS Gothic"/>
+                </w14:checkbox>
+              </w:sdtPr>
+              <w:sdtContent>
+                <w:r>
+                  <w:rPr>
+                    <w:rFonts w:ascii="MS Gothic" w:hAnsi="MS Gothic"/>
+                  </w:rPr>
+                  <w:t>☐</w:t>
+                </w:r>
+              </w:sdtContent>
+            </w:sdt>
+            <w:r>
+              <w:rPr>
+                <w:sz w:val="16"/>
+              </w:rPr>
+              <w:t xml:space="preserve"> Not selected</w:t>
             </w:r>
           </w:p>
         </w:tc>
       </w:tr>
     </w:tbl>
+    <w:p>
+      <w:pPr>
+        <w:spacing w:before="0" w:after="100"/>
+      </w:pPr>
+      <w:r>
+        <w:rPr>
+          <w:rFonts w:ascii="Aptos" w:hAnsi="Aptos"/>
+          <w:i/>
+          <w:color w:val="536875"/>
+          <w:sz w:val="18"/>
+        </w:rPr>
+        <w:t>Digital completion: click the text prompts to type and click a box to select your plan. The document remains editable in Word.</w:t>
+      </w:r>
+    </w:p>
     <w:p>
       <w:pPr>
         <w:spacing w:after="0"/>
@@ -613,12 +850,13 @@
     <w:tbl>
       <w:tblPr>
         <w:tblW w:type="auto" w:w="0"/>
-        <w:jc w:val="center"/>
         <w:tblLayout w:type="fixed"/>
         <w:tblLook w:firstColumn="1" w:firstRow="1" w:lastColumn="0" w:lastRow="0" w:noHBand="0" w:noVBand="1" w:val="04A0"/>
+        <w:jc w:val="left"/>
+        <w:tblInd w:w="0" w:type="dxa"/>
       </w:tblPr>
       <w:tblGrid>
-        <w:gridCol w:w="10152"/>
+        <w:gridCol w:w="9547"/>
       </w:tblGrid>
       <w:tr>
         <w:trPr>
@@ -626,7 +864,7 @@
         </w:trPr>
         <w:tc>
           <w:tcPr>
-            <w:tcW w:type="dxa" w:w="10152"/>
+            <w:tcW w:type="dxa" w:w="9547"/>
             <w:shd w:fill="EAF2F5"/>
             <w:tcMar>
               <w:top w:w="130" w:type="dxa"/>
@@ -759,7 +997,7 @@
         </w:trPr>
         <w:tc>
           <w:tcPr>
-            <w:tcW w:type="dxa" w:w="10152"/>
+            <w:tcW w:type="dxa" w:w="9547"/>
             <w:shd w:fill="EAF2F5"/>
             <w:tcMar>
               <w:top w:w="130" w:type="dxa"/>
@@ -892,7 +1130,7 @@
         </w:trPr>
         <w:tc>
           <w:tcPr>
-            <w:tcW w:type="dxa" w:w="10152"/>
+            <w:tcW w:type="dxa" w:w="9547"/>
             <w:shd w:fill="EAF2F5"/>
             <w:tcMar>
               <w:top w:w="130" w:type="dxa"/>
@@ -1256,13 +1494,14 @@
     <w:tbl>
       <w:tblPr>
         <w:tblW w:type="auto" w:w="0"/>
-        <w:jc w:val="center"/>
         <w:tblLayout w:type="fixed"/>
         <w:tblLook w:firstColumn="1" w:firstRow="1" w:lastColumn="0" w:lastRow="0" w:noHBand="0" w:noVBand="1" w:val="04A0"/>
+        <w:jc w:val="left"/>
+        <w:tblInd w:w="0" w:type="dxa"/>
       </w:tblPr>
       <w:tblGrid>
-        <w:gridCol w:w="4824"/>
-        <w:gridCol w:w="4824"/>
+        <w:gridCol w:w="4773"/>
+        <w:gridCol w:w="4774"/>
       </w:tblGrid>
       <w:tr>
         <w:trPr>
@@ -1271,7 +1510,7 @@
         </w:trPr>
         <w:tc>
           <w:tcPr>
-            <w:tcW w:type="dxa" w:w="4824"/>
+            <w:tcW w:type="dxa" w:w="4773"/>
             <w:tcMar>
               <w:top w:w="160" w:type="dxa"/>
               <w:start w:w="150" w:type="dxa"/>
@@ -1302,49 +1541,101 @@
               <w:spacing w:before="160" w:after="60"/>
             </w:pPr>
             <w:r>
-              <w:rPr>
-                <w:sz w:val="17"/>
-              </w:rPr>
-              <w:t>Name: __________________________________</w:t>
+              <w:t xml:space="preserve">Name: </w:t>
             </w:r>
+            <w:sdt>
+              <w:sdtPr>
+                <w:alias w:val="Lumeo name"/>
+                <w:tag w:val="lumeo.lumeo-name"/>
+                <w:text/>
+              </w:sdtPr>
+              <w:sdtContent>
+                <w:r>
+                  <w:rPr>
+                    <w:color w:val="6E7E88"/>
+                    <w:i/>
+                  </w:rPr>
+                  <w:t xml:space="preserve">Click or tap to enter name</w:t>
+                </w:r>
+              </w:sdtContent>
+            </w:sdt>
           </w:p>
           <w:p>
             <w:pPr>
               <w:spacing w:before="160" w:after="60"/>
             </w:pPr>
             <w:r>
-              <w:rPr>
-                <w:sz w:val="17"/>
-              </w:rPr>
-              <w:t>Title: ___________________________________</w:t>
+              <w:t xml:space="preserve">Title: </w:t>
             </w:r>
+            <w:sdt>
+              <w:sdtPr>
+                <w:alias w:val="Lumeo title"/>
+                <w:tag w:val="lumeo.lumeo-title"/>
+                <w:text/>
+              </w:sdtPr>
+              <w:sdtContent>
+                <w:r>
+                  <w:rPr>
+                    <w:color w:val="6E7E88"/>
+                    <w:i/>
+                  </w:rPr>
+                  <w:t xml:space="preserve">Click or tap to enter title</w:t>
+                </w:r>
+              </w:sdtContent>
+            </w:sdt>
           </w:p>
           <w:p>
             <w:pPr>
               <w:spacing w:before="160" w:after="60"/>
             </w:pPr>
             <w:r>
-              <w:rPr>
-                <w:sz w:val="17"/>
-              </w:rPr>
-              <w:t>Signature: ______________________________</w:t>
+              <w:t xml:space="preserve">Signature: </w:t>
             </w:r>
+            <w:sdt>
+              <w:sdtPr>
+                <w:alias w:val="Lumeo signature"/>
+                <w:tag w:val="lumeo.lumeo-signature"/>
+                <w:text/>
+              </w:sdtPr>
+              <w:sdtContent>
+                <w:r>
+                  <w:rPr>
+                    <w:color w:val="6E7E88"/>
+                    <w:i/>
+                  </w:rPr>
+                  <w:t xml:space="preserve">Type name or insert e-signature</w:t>
+                </w:r>
+              </w:sdtContent>
+            </w:sdt>
           </w:p>
           <w:p>
             <w:pPr>
               <w:spacing w:before="160" w:after="60"/>
             </w:pPr>
             <w:r>
-              <w:rPr>
-                <w:sz w:val="17"/>
-              </w:rPr>
-              <w:t>Date: ___________________________________</w:t>
+              <w:t xml:space="preserve">Date: </w:t>
             </w:r>
+            <w:sdt>
+              <w:sdtPr>
+                <w:alias w:val="Lumeo signature date"/>
+                <w:tag w:val="lumeo.lumeo-signature-date"/>
+                <w:text/>
+              </w:sdtPr>
+              <w:sdtContent>
+                <w:r>
+                  <w:rPr>
+                    <w:color w:val="6E7E88"/>
+                    <w:i/>
+                  </w:rPr>
+                  <w:t xml:space="preserve">Click or tap to enter date</w:t>
+                </w:r>
+              </w:sdtContent>
+            </w:sdt>
           </w:p>
         </w:tc>
         <w:tc>
           <w:tcPr>
-            <w:tcW w:type="dxa" w:w="4824"/>
+            <w:tcW w:type="dxa" w:w="4774"/>
             <w:tcMar>
               <w:top w:w="160" w:type="dxa"/>
               <w:start w:w="150" w:type="dxa"/>
@@ -1375,44 +1666,96 @@
               <w:spacing w:before="160" w:after="60"/>
             </w:pPr>
             <w:r>
-              <w:rPr>
-                <w:sz w:val="17"/>
-              </w:rPr>
-              <w:t>Name: __________________________________</w:t>
+              <w:t xml:space="preserve">Name: </w:t>
             </w:r>
+            <w:sdt>
+              <w:sdtPr>
+                <w:alias w:val="Client name"/>
+                <w:tag w:val="lumeo.client-name"/>
+                <w:text/>
+              </w:sdtPr>
+              <w:sdtContent>
+                <w:r>
+                  <w:rPr>
+                    <w:color w:val="6E7E88"/>
+                    <w:i/>
+                  </w:rPr>
+                  <w:t xml:space="preserve">Click or tap to enter name</w:t>
+                </w:r>
+              </w:sdtContent>
+            </w:sdt>
           </w:p>
           <w:p>
             <w:pPr>
               <w:spacing w:before="160" w:after="60"/>
             </w:pPr>
             <w:r>
-              <w:rPr>
-                <w:sz w:val="17"/>
-              </w:rPr>
-              <w:t>Title: ___________________________________</w:t>
+              <w:t xml:space="preserve">Title: </w:t>
             </w:r>
+            <w:sdt>
+              <w:sdtPr>
+                <w:alias w:val="Client title"/>
+                <w:tag w:val="lumeo.client-title"/>
+                <w:text/>
+              </w:sdtPr>
+              <w:sdtContent>
+                <w:r>
+                  <w:rPr>
+                    <w:color w:val="6E7E88"/>
+                    <w:i/>
+                  </w:rPr>
+                  <w:t xml:space="preserve">Click or tap to enter title</w:t>
+                </w:r>
+              </w:sdtContent>
+            </w:sdt>
           </w:p>
           <w:p>
             <w:pPr>
               <w:spacing w:before="160" w:after="60"/>
             </w:pPr>
             <w:r>
-              <w:rPr>
-                <w:sz w:val="17"/>
-              </w:rPr>
-              <w:t>Signature: ______________________________</w:t>
+              <w:t xml:space="preserve">Signature: </w:t>
             </w:r>
+            <w:sdt>
+              <w:sdtPr>
+                <w:alias w:val="Client signature"/>
+                <w:tag w:val="lumeo.client-signature"/>
+                <w:text/>
+              </w:sdtPr>
+              <w:sdtContent>
+                <w:r>
+                  <w:rPr>
+                    <w:color w:val="6E7E88"/>
+                    <w:i/>
+                  </w:rPr>
+                  <w:t xml:space="preserve">Type name or insert e-signature</w:t>
+                </w:r>
+              </w:sdtContent>
+            </w:sdt>
           </w:p>
           <w:p>
             <w:pPr>
               <w:spacing w:before="160" w:after="60"/>
             </w:pPr>
             <w:r>
-              <w:rPr>
-                <w:sz w:val="17"/>
-              </w:rPr>
-              <w:t>Date: ___________________________________</w:t>
+              <w:t xml:space="preserve">Date: </w:t>
             </w:r>
+            <w:sdt>
+              <w:sdtPr>
+                <w:alias w:val="Client signature date"/>
+                <w:tag w:val="lumeo.client-signature-date"/>
+                <w:text/>
+              </w:sdtPr>
+              <w:sdtContent>
+                <w:r>
+                  <w:rPr>
+                    <w:color w:val="6E7E88"/>
+                    <w:i/>
+                  </w:rPr>
+                  <w:t xml:space="preserve">Click or tap to enter date</w:t>
+                </w:r>
+              </w:sdtContent>
+            </w:sdt>
           </w:p>
         </w:tc>
       </w:tr>

</xml_diff>